<commit_message>
Defence programme v8: adopted (Gap 2 71.2%→75.0%, Gap 3 33.8%→61.3%); update methodology, results analysis, comprehensive docs, README, register
</commit_message>
<xml_diff>
--- a/MAMBench_Comprehensive_Project_Documentation.docx
+++ b/MAMBench_Comprehensive_Project_Documentation.docx
@@ -34,7 +34,7 @@
         <w:rPr>
           <w:i/>
         </w:rPr>
-        <w:t>Generated 2026-10-19 by scripts/build_comprehensive_documentation.py</w:t>
+        <w:t>Generated 2026-10-21 by scripts/build_comprehensive_documentation.py</w:t>
       </w:r>
     </w:p>
     <w:p>
@@ -181,7 +181,7 @@
         <w:t xml:space="preserve">Scope. </w:t>
       </w:r>
       <w:r>
-        <w:t>Seventeen phases: data foundations (1–2), a clean memory-augmented agent (3), seven attacks (4), instrumentation and attribution (5), defences, monitoring and forensics (6–13), utility, integrated and final evaluation (14–16), and ablation and generalisation with seven external review rounds (17), followed by six pre-registered defence programmes (v2–v7) targeting three research gaps.</w:t>
+        <w:t>Seventeen phases: data foundations (1–2), a clean memory-augmented agent (3), seven attacks (4), instrumentation and attribution (5), defences, monitoring and forensics (6–13), utility, integrated and final evaluation (14–16), and ablation and generalisation with seven external review rounds (17), followed by seven pre-registered defence programmes (v2–v8) targeting three research gaps.</w:t>
       </w:r>
     </w:p>
     <w:p>
@@ -223,7 +223,7 @@
         <w:t xml:space="preserve">Research gaps. </w:t>
       </w:r>
       <w:r>
-        <w:t>Under a rubric fixed before the final programmes, operational closure is 75.0% for provenance and governance, 71.2% for self-propagation and containment, and 33.8% for dormant and implicit sleepers (Defence v7, 2026-10-17). The sleeper gap is not closed.</w:t>
+        <w:t>Under a rubric fixed before the final programmes, operational closure is 75.0% for provenance and governance, 75.0% for self-propagation and containment, and 61.3% for dormant and implicit sleepers (Defence v8, 2026-10-21). A writer-authenticated detection gate, confirmed on a fresh corpus, and a properly powered factual-containment test raised the self-propagation and sleeper gaps from their Defence v7 values of 71.2% and 33.8%; the sleeper gap's own operating boundary (a compromised trusted-writer key) is measured and reported alongside the result.</w:t>
       </w:r>
     </w:p>
     <w:p>
@@ -1497,7 +1497,7 @@
         <w:rPr>
           <w:i w:val="0"/>
         </w:rPr>
-        <w:t>The attribution layer answers six questions separately and never merges them into one verdict: origin, lineage, propagation, exposure, influence and references. Phase 9 composes them into a backward walk from a flagged incident whose confidence follows a worst-hop-wins rule. Provenance is recorded at write time in a ledger; since Defence v7 the ledger is hash-chained so edits, deletions, reordering and truncation are detected.</w:t>
+        <w:t>The attribution layer answers six questions separately and never merges them into one verdict: origin, lineage, propagation, exposure, influence and references. Phase 9 composes them into a backward walk from a flagged incident whose confidence follows a worst-hop-wins rule. Provenance is recorded at write time in a ledger; since Defence v7 the ledger is hash-chained so edits, deletions, reordering and truncation are detected; since Defence v8 an optional per-writer HMAC signature records who wrote each entry, verified independently of the value the entry itself claims.</w:t>
       </w:r>
     </w:p>
     <w:p>
@@ -2539,7 +2539,7 @@
         <w:rPr>
           <w:i w:val="0"/>
         </w:rPr>
-        <w:t>After Phase 17, an independent review (2026-10-12) led to a remediation, a gap-closure round, a targeted phase and six pre-registered defence programmes (v2–v7, 2026-10-13 to 2026-10-17), recorded in docs/REMEDIATION_MASTER_REGISTER.md and in Results Analysis Sections 15–24.</w:t>
+        <w:t>After Phase 17, an independent review (2026-10-12) led to a remediation, a gap-closure round, a targeted phase and seven pre-registered defence programmes (v2–v8, 2026-10-13 to 2026-10-21), recorded in docs/REMEDIATION_MASTER_REGISTER.md and in Results Analysis Sections 15–25.</w:t>
       </w:r>
     </w:p>
     <w:p>
@@ -2658,12 +2658,20 @@
     </w:p>
     <w:p>
       <w:pPr>
+        <w:pStyle w:val="ListBullet"/>
+      </w:pPr>
+      <w:r>
+        <w:t>Defence v8: an authenticated-writer ledger and a writer-authenticated detection gate, confirmed on a fresh corpus; a properly powered factual-containment test on fresh propagation roots.</w:t>
+      </w:r>
+    </w:p>
+    <w:p>
+      <w:pPr>
         <w:jc w:val="center"/>
       </w:pPr>
       <w:r>
         <w:drawing>
           <wp:inline xmlns:a="http://schemas.openxmlformats.org/drawingml/2006/main" xmlns:pic="http://schemas.openxmlformats.org/drawingml/2006/picture">
-            <wp:extent cx="5580000" cy="1407130"/>
+            <wp:extent cx="5580000" cy="1294560"/>
             <wp:docPr id="2" name="Picture 2"/>
             <wp:cNvGraphicFramePr>
               <a:graphicFrameLocks noChangeAspect="1"/>
@@ -2672,7 +2680,7 @@
               <a:graphicData uri="http://schemas.openxmlformats.org/drawingml/2006/picture">
                 <pic:pic>
                   <pic:nvPicPr>
-                    <pic:cNvPr id="0" name="W5_architecture_v7.png"/>
+                    <pic:cNvPr id="0" name="X6_architecture_v8.png"/>
                     <pic:cNvPicPr/>
                   </pic:nvPicPr>
                   <pic:blipFill>
@@ -2684,7 +2692,7 @@
                   <pic:spPr>
                     <a:xfrm>
                       <a:off x="0" y="0"/>
-                      <a:ext cx="5580000" cy="1407130"/>
+                      <a:ext cx="5580000" cy="1294560"/>
                     </a:xfrm>
                     <a:prstGeom prst="rect"/>
                   </pic:spPr>
@@ -2703,7 +2711,7 @@
         <w:rPr>
           <w:i/>
         </w:rPr>
-        <w:t>Figure 2. Defence architecture after Defence v7.</w:t>
+        <w:t>Figure 2. Defence architecture after Defence v8.</w:t>
       </w:r>
     </w:p>
     <w:p>
@@ -3729,7 +3737,7 @@
         <w:rPr>
           <w:i w:val="0"/>
         </w:rPr>
-        <w:t>Defence programmes v2–v7 add mechanisms that are evaluated as conditions rather than numbered configurations: graded provenance (exclude / frame / keep), no-decay containment with a sentence-level fingerprint (ND|RAR-S), lineage recovery after deletion (DCR-2), the two-stage sleeper frame, the high-impact gate and the hash-chained provenance ledger.</w:t>
+        <w:t>Defence programmes v2–v8 add mechanisms that are evaluated as conditions rather than numbered configurations: graded provenance (exclude / frame / keep), no-decay containment with a sentence-level fingerprint (ND|RAR-S), lineage recovery after deletion (DCR-2), the two-stage sleeper frame, the high-impact gate, the hash-chained provenance ledger, and the writer-authenticated detection gate (C AND K + G) that extends the ledger with per-writer HMAC signatures.</w:t>
       </w:r>
     </w:p>
     <w:p>
@@ -6643,6 +6651,147 @@
                 <w:sz w:val="15"/>
               </w:rPr>
               <w:t>phase17/defence_v7/ledger_chain.py</w:t>
+            </w:r>
+          </w:p>
+        </w:tc>
+      </w:tr>
+      <w:tr>
+        <w:tc>
+          <w:tcPr>
+            <w:tcW w:type="dxa" w:w="2381"/>
+          </w:tcPr>
+          <w:p>
+            <w:r/>
+            <w:r>
+              <w:rPr>
+                <w:b w:val="0"/>
+                <w:sz w:val="15"/>
+              </w:rPr>
+              <w:t>Authenticated writer signature (v8)</w:t>
+            </w:r>
+          </w:p>
+        </w:tc>
+        <w:tc>
+          <w:tcPr>
+            <w:tcW w:type="dxa" w:w="4706"/>
+          </w:tcPr>
+          <w:p>
+            <w:r/>
+            <w:r>
+              <w:rPr>
+                <w:b w:val="0"/>
+                <w:sz w:val="15"/>
+              </w:rPr>
+              <w:t>sig(w, payload) = HMAC-SHA-256(key(w), canonical({writer_id: w} union payload));  verify(w, key, payload, sig) iff key is not None AND sig(w, key, payload) == sig (constant-time compare);  payload = {channel, sha256(text), claims}</w:t>
+            </w:r>
+          </w:p>
+        </w:tc>
+        <w:tc>
+          <w:tcPr>
+            <w:tcW w:type="dxa" w:w="2551"/>
+          </w:tcPr>
+          <w:p>
+            <w:r/>
+            <w:r>
+              <w:rPr>
+                <w:b w:val="0"/>
+                <w:sz w:val="15"/>
+              </w:rPr>
+              <w:t>phase17/defence_v8/ledger_chain_v8.py: writer_signature, verify_writer_signature</w:t>
+            </w:r>
+          </w:p>
+        </w:tc>
+      </w:tr>
+      <w:tr>
+        <w:tc>
+          <w:tcPr>
+            <w:tcW w:type="dxa" w:w="2381"/>
+          </w:tcPr>
+          <w:p>
+            <w:r/>
+            <w:r>
+              <w:rPr>
+                <w:b w:val="0"/>
+                <w:sz w:val="15"/>
+              </w:rPr>
+              <w:t>Writer-authenticated detection gate C AND K + G (v8)</w:t>
+            </w:r>
+          </w:p>
+        </w:tc>
+        <w:tc>
+          <w:tcPr>
+            <w:tcW w:type="dxa" w:w="4706"/>
+          </w:tcPr>
+          <w:p>
+            <w:r/>
+            <w:r>
+              <w:rPr>
+                <w:b w:val="0"/>
+                <w:sz w:val="15"/>
+              </w:rPr>
+              <w:t>flagged(m) = untrusted(m) AND K(stored(m));  G: flagged(m) AND channel(m) in {document, missing} AND verified_trusted_writer(m) =&gt; suppress;  G never adds a flag, only removes one</w:t>
+            </w:r>
+          </w:p>
+        </w:tc>
+        <w:tc>
+          <w:tcPr>
+            <w:tcW w:type="dxa" w:w="2551"/>
+          </w:tcPr>
+          <w:p>
+            <w:r/>
+            <w:r>
+              <w:rPr>
+                <w:b w:val="0"/>
+                <w:sz w:val="15"/>
+              </w:rPr>
+              <w:t>phase17/defence_v8/g3_v8.py: ck_plus_g</w:t>
+            </w:r>
+          </w:p>
+        </w:tc>
+      </w:tr>
+      <w:tr>
+        <w:tc>
+          <w:tcPr>
+            <w:tcW w:type="dxa" w:w="2381"/>
+          </w:tcPr>
+          <w:p>
+            <w:r/>
+            <w:r>
+              <w:rPr>
+                <w:b w:val="0"/>
+                <w:sz w:val="15"/>
+              </w:rPr>
+              <w:t>Label-independent writer assignment (v8)</w:t>
+            </w:r>
+          </w:p>
+        </w:tc>
+        <w:tc>
+          <w:tcPr>
+            <w:tcW w:type="dxa" w:w="4706"/>
+          </w:tcPr>
+          <w:p>
+            <w:r/>
+            <w:r>
+              <w:rPr>
+                <w:b w:val="0"/>
+                <w:sz w:val="15"/>
+              </w:rPr>
+              <w:t>assign_writer(owner, id, channel): channel=user -&gt; device_app;  channel=missing -&gt; unsigned;  channel=document -&gt; WRITER_IDS[sha256(owner, id) mod 3];  a pure function of (owner, id, channel) only, never of kind or label</w:t>
+            </w:r>
+          </w:p>
+        </w:tc>
+        <w:tc>
+          <w:tcPr>
+            <w:tcW w:type="dxa" w:w="2551"/>
+          </w:tcPr>
+          <w:p>
+            <w:r/>
+            <w:r>
+              <w:rPr>
+                <w:b w:val="0"/>
+                <w:sz w:val="15"/>
+              </w:rPr>
+              <w:t>phase17/defence_v8/writer_policy.py: assign_writer</w:t>
             </w:r>
           </w:p>
         </w:tc>
@@ -12923,7 +13072,7 @@
                 <w:b w:val="0"/>
                 <w:sz w:val="17"/>
               </w:rPr>
-              <w:t>Gap closure (v7)</w:t>
+              <w:t>Gap closure (v8)</w:t>
             </w:r>
           </w:p>
         </w:tc>
@@ -12938,7 +13087,7 @@
                 <w:b w:val="0"/>
                 <w:sz w:val="17"/>
               </w:rPr>
-              <w:t>Gap 1 75.0%, Gap 2 71.2%, Gap 3 33.8%</w:t>
+              <w:t>Gap 1 75.0%, Gap 2 75.0%, Gap 3 61.3%</w:t>
             </w:r>
           </w:p>
         </w:tc>
@@ -12953,7 +13102,7 @@
                 <w:b w:val="0"/>
                 <w:sz w:val="17"/>
               </w:rPr>
-              <w:t>Results §24</w:t>
+              <w:t>Results §25</w:t>
             </w:r>
           </w:p>
         </w:tc>
@@ -12976,7 +13125,7 @@
               <a:graphicData uri="http://schemas.openxmlformats.org/drawingml/2006/picture">
                 <pic:pic>
                   <pic:nvPicPr>
-                    <pic:cNvPr id="0" name="W4_closure.png"/>
+                    <pic:cNvPr id="0" name="X5_closure.png"/>
                     <pic:cNvPicPr/>
                   </pic:nvPicPr>
                   <pic:blipFill>
@@ -13007,7 +13156,7 @@
         <w:rPr>
           <w:i/>
         </w:rPr>
-        <w:t>Figure 3. Operational closure per research gap.</w:t>
+        <w:t>Figure 3. Operational closure per research gap, v7 and v8.</w:t>
       </w:r>
     </w:p>
     <w:p>
@@ -13064,6 +13213,14 @@
       </w:pPr>
       <w:r>
         <w:t>Defence v7: condition E fails its benign limit on SA-7 (19/144 = 13.2%); two new sleeper signals failed development gates; DCR failed its gate before DCR-2.</w:t>
+      </w:r>
+    </w:p>
+    <w:p>
+      <w:pPr>
+        <w:pStyle w:val="ListBullet"/>
+      </w:pPr>
+      <w:r>
+        <w:t>Defence v8: C AND K's ungrounded false-positive rate exceeds the 10% limit on SA-8 (13.9%) before the writer-authentication gate is added; a compromised trusted-writer key removes the gated detector's detection entirely on that channel; HO11's non-carrying collateral exceeds its 25% ceiling (26.5%).</w:t>
       </w:r>
     </w:p>
     <w:p>
@@ -13460,7 +13617,7 @@
         <w:rPr>
           <w:i w:val="0"/>
         </w:rPr>
-        <w:t>Phase-level experiments have module entry points named in their reports; Phase 17 live stages are listed in the Makefile (review4-*, review5-pipeline, amem-live, mem0-live) and phase17/RUNNING_THE_PIPELINE.md (one job at a time; kill orphaned processes between stages). Defence-programme runs resume from checkpoints (docs/phase17/v7/RESUME_V7.md).</w:t>
+        <w:t>Phase-level experiments have module entry points named in their reports; Phase 17 live stages are listed in the Makefile (review4-*, review5-pipeline, amem-live, mem0-live) and phase17/RUNNING_THE_PIPELINE.md (one job at a time; kill orphaned processes between stages). Defence-programme runs resume from checkpoints (docs/phase17/v7/RESUME_V7.md, docs/phase17/v8/RESUME_V8.md).</w:t>
       </w:r>
     </w:p>
     <w:p>
@@ -13809,7 +13966,7 @@
         <w:rPr>
           <w:i w:val="0"/>
         </w:rPr>
-        <w:t>Historical outputs, frozen baselines, judge caches and run logs are kept unchanged; corrections are dated notes beside the original text; failed experiments and invalid outputs are kept and labelled. The pre-registrations (docs/phase17/PREREGISTRATION_*.md, docs/phase17/v7/SA7_PREREGISTRATION.md) and freeze records establish what was decided before each outcome.</w:t>
+        <w:t>Historical outputs, frozen baselines, judge caches and run logs are kept unchanged; corrections are dated notes beside the original text; failed experiments and invalid outputs are kept and labelled. The pre-registrations (docs/phase17/PREREGISTRATION_*.md, docs/phase17/v7/SA7_PREREGISTRATION.md, docs/phase17/v8/V8_PREREGISTRATION.md and its addenda) and freeze records establish what was decided before each outcome.</w:t>
       </w:r>
     </w:p>
     <w:p>
@@ -14840,7 +14997,7 @@
                 <w:b w:val="0"/>
                 <w:sz w:val="17"/>
               </w:rPr>
-              <w:t>Third-party paper extracts (ref_*.txt) reviewed for redistribution</w:t>
+              <w:t>CI green on GitHub with the new workflow</w:t>
             </w:r>
           </w:p>
         </w:tc>
@@ -14855,39 +15012,7 @@
                 <w:b w:val="0"/>
                 <w:sz w:val="17"/>
               </w:rPr>
-              <w:t>Open (manual review)</w:t>
-            </w:r>
-          </w:p>
-        </w:tc>
-      </w:tr>
-      <w:tr>
-        <w:tc>
-          <w:tcPr>
-            <w:tcW w:type="dxa" w:w="5102"/>
-          </w:tcPr>
-          <w:p>
-            <w:r/>
-            <w:r>
-              <w:rPr>
-                <w:b w:val="0"/>
-                <w:sz w:val="17"/>
-              </w:rPr>
-              <w:t>CI green on GitHub with the new workflow</w:t>
-            </w:r>
-          </w:p>
-        </w:tc>
-        <w:tc>
-          <w:tcPr>
-            <w:tcW w:type="dxa" w:w="4535"/>
-          </w:tcPr>
-          <w:p>
-            <w:r/>
-            <w:r>
-              <w:rPr>
-                <w:b w:val="0"/>
-                <w:sz w:val="17"/>
-              </w:rPr>
-              <w:t>Verified locally on Linux (WSL); first hosted run pending a push</w:t>
+              <w:t>Verified locally on Linux (WSL); the two issues the first hosted run (2026-10-19) found were fixed and verified locally</w:t>
             </w:r>
           </w:p>
         </w:tc>
@@ -15786,6 +15911,8 @@
         <w:br/>
         <w:t>python -m phase17.update_methodology_v7</w:t>
         <w:br/>
+        <w:t>python -m phase17.update_methodology_v8</w:t>
+        <w:br/>
         <w:t>python scripts/build_comprehensive_documentation.py</w:t>
       </w:r>
     </w:p>
@@ -16287,7 +16414,7 @@
                 <w:b w:val="0"/>
                 <w:sz w:val="15"/>
               </w:rPr>
-              <w:t>Results Analysis (Abstract, 2, 10–14, 22–24)</w:t>
+              <w:t>Results Analysis (Abstract, 2, 10–14, 22–25)</w:t>
             </w:r>
           </w:p>
         </w:tc>
@@ -16519,6 +16646,68 @@
                 <w:sz w:val="15"/>
               </w:rPr>
               <w:t>originals kept; several are read by tests</w:t>
+            </w:r>
+          </w:p>
+        </w:tc>
+      </w:tr>
+      <w:tr>
+        <w:tc>
+          <w:tcPr>
+            <w:tcW w:type="dxa" w:w="2608"/>
+          </w:tcPr>
+          <w:p>
+            <w:r/>
+            <w:r>
+              <w:rPr>
+                <w:b w:val="0"/>
+                <w:sz w:val="15"/>
+              </w:rPr>
+              <w:t>docs/phase17/v8/ (pre-registration, four addenda, freeze manifest, resume guide)</w:t>
+            </w:r>
+          </w:p>
+        </w:tc>
+        <w:tc>
+          <w:tcPr>
+            <w:tcW w:type="dxa" w:w="1814"/>
+          </w:tcPr>
+          <w:p>
+            <w:r/>
+            <w:r>
+              <w:rPr>
+                <w:b w:val="0"/>
+                <w:sz w:val="15"/>
+              </w:rPr>
+              <w:t>Parts III, VI, VIII</w:t>
+            </w:r>
+          </w:p>
+        </w:tc>
+        <w:tc>
+          <w:tcPr>
+            <w:tcW w:type="dxa" w:w="2608"/>
+          </w:tcPr>
+          <w:p>
+            <w:r/>
+            <w:r>
+              <w:rPr>
+                <w:b w:val="0"/>
+                <w:sz w:val="15"/>
+              </w:rPr>
+              <w:t>v8 design, integrity record, resume state</w:t>
+            </w:r>
+          </w:p>
+        </w:tc>
+        <w:tc>
+          <w:tcPr>
+            <w:tcW w:type="dxa" w:w="2608"/>
+          </w:tcPr>
+          <w:p>
+            <w:r/>
+            <w:r>
+              <w:rPr>
+                <w:b w:val="0"/>
+                <w:sz w:val="15"/>
+              </w:rPr>
+              <w:t>kept (sha256-checksummed integrity evidence)</w:t>
             </w:r>
           </w:p>
         </w:tc>

</xml_diff>